<commit_message>
Add site-context image, fix content-control boxes, swap in new template, update fonts
- Add Figure 1 site-context aerial image (Esri World Imagery, keyless),
  wired through docxtemplater's image module with a graceful fallback
  note when the live fetch fails.
- Fix revision-history date to render as DD/MM/YYYY instead of raw ISO.
- Trim redundant text from the development-type dropdown labels.
- Swap in GIW's newly supplied report template and strip its data-bound
  content controls (Project Address/Client boxes) so they render as
  plain merged text instead of visible input boxes in the Introduction,
  Subject Site, Figure 1 caption, and cover page.
- Switch frontend to Roboto (Light for body, regular weight for
  headings) via Google Fonts.
</commit_message>
<xml_diff>
--- a/backend/src/docx/template.docx
+++ b/backend/src/docx/template.docx
@@ -41,35 +41,15 @@
                 <w:lang w:val="en-US"/>
               </w:rPr>
             </w:pPr>
-            <w:sdt>
-              <w:sdtPr>
-                <w:rPr>
-                  <w:rFonts w:ascii="Roboto" w:eastAsia="Roboto" w:hAnsi="Roboto" w:cs="Roboto"/>
-                  <w:color w:val="FFFFFF"/>
-                  <w:sz w:val="20"/>
-                  <w:lang w:val="en-US"/>
-                </w:rPr>
-                <w:alias w:val="Company Address"/>
-                <w:tag w:val=""/>
-                <w:id w:val="923767708"/>
-                <w:placeholder>
-                  <w:docPart w:val="41DA5BA0B71C4FF39EB709685C5366A2"/>
-                </w:placeholder>
-                <w:dataBinding w:prefixMappings="xmlns:ns0='http://schemas.microsoft.com/office/2006/coverPageProps' " w:xpath="/ns0:CoverPageProperties[1]/ns0:CompanyAddress[1]" w:storeItemID="{55AF091B-3C7A-41E3-B477-F2FDAA23CFDA}"/>
-                <w:text/>
-              </w:sdtPr>
-              <w:sdtContent>
-                <w:r>
-                  <w:rPr>
-                    <w:rFonts w:ascii="Roboto" w:eastAsia="Roboto" w:hAnsi="Roboto" w:cs="Roboto"/>
-                    <w:color w:val="FFFFFF"/>
-                    <w:sz w:val="20"/>
-                    <w:lang w:val="en-US"/>
-                  </w:rPr>
-                  <w:t w:space="preserve">{projectAddress}</w:t>
-                </w:r>
-              </w:sdtContent>
-            </w:sdt>
+            <w:r>
+              <w:rPr>
+                <w:rFonts w:ascii="Roboto" w:eastAsia="Roboto" w:hAnsi="Roboto" w:cs="Roboto"/>
+                <w:color w:val="FFFFFF"/>
+                <w:sz w:val="20"/>
+                <w:lang w:val="en-US"/>
+              </w:rPr>
+              <w:t w:space="preserve">{projectAddress}</w:t>
+            </w:r>
             <w:r>
               <w:rPr>
                 <w:rFonts w:ascii="Roboto" w:eastAsia="Roboto" w:hAnsi="Roboto" w:cs="Roboto"/>
@@ -191,34 +171,16 @@
                 <w:lang w:val="en-US"/>
               </w:rPr>
             </w:pPr>
-            <w:sdt>
-              <w:sdtPr>
-                <w:rPr>
-                  <w:rFonts w:ascii="Roboto" w:eastAsia="Roboto" w:hAnsi="Roboto" w:cs="Roboto"/>
-                  <w:color w:val="FFFFFF"/>
-                  <w:spacing w:val="-4"/>
-                  <w:sz w:val="20"/>
-                  <w:lang w:val="en-US"/>
-                </w:rPr>
-                <w:alias w:val="Company"/>
-                <w:tag w:val="Company"/>
-                <w:id w:val="1830028022"/>
-                <w:dataBinding w:prefixMappings="xmlns:ns0='http://schemas.openxmlformats.org/officeDocument/2006/extended-properties' " w:xpath="/ns0:Properties[1]/ns0:Company[1]" w:storeItemID="{6668398D-A668-4E3E-A5EB-62B293D839F1}"/>
-                <w:text/>
-              </w:sdtPr>
-              <w:sdtContent>
-                <w:r>
-                  <w:rPr>
-                    <w:rFonts w:ascii="Roboto" w:eastAsia="Roboto" w:hAnsi="Roboto" w:cs="Roboto"/>
-                    <w:color w:val="FFFFFF"/>
-                    <w:spacing w:val="-4"/>
-                    <w:sz w:val="20"/>
-                    <w:lang w:val="en-US"/>
-                  </w:rPr>
-                  <w:t w:space="preserve">{client}</w:t>
-                </w:r>
-              </w:sdtContent>
-            </w:sdt>
+            <w:r>
+              <w:rPr>
+                <w:rFonts w:ascii="Roboto" w:eastAsia="Roboto" w:hAnsi="Roboto" w:cs="Roboto"/>
+                <w:color w:val="FFFFFF"/>
+                <w:spacing w:val="-4"/>
+                <w:sz w:val="20"/>
+                <w:lang w:val="en-US"/>
+              </w:rPr>
+              <w:t w:space="preserve">{client}</w:t>
+            </w:r>
             <w:r>
               <w:rPr>
                 <w:rFonts w:ascii="Roboto" w:eastAsia="Roboto" w:hAnsi="Roboto" w:cs="Roboto"/>
@@ -1892,11 +1854,11 @@
         <w:br w:type="page"/>
       </w:r>
     </w:p>
-    <w:bookmarkStart w:id="11" w:name="_Toc209592307" w:displacedByCustomXml="next"/>
-    <w:bookmarkStart w:id="12" w:name="_Toc209557015" w:displacedByCustomXml="next"/>
+    <w:bookmarkStart w:id="11" w:name="_Toc233786721" w:displacedByCustomXml="next"/>
+    <w:bookmarkStart w:id="12" w:name="_Toc209555290" w:displacedByCustomXml="next"/>
     <w:bookmarkStart w:id="13" w:name="_Toc209555543" w:displacedByCustomXml="next"/>
-    <w:bookmarkStart w:id="14" w:name="_Toc209555290" w:displacedByCustomXml="next"/>
-    <w:bookmarkStart w:id="15" w:name="_Toc233786721" w:displacedByCustomXml="next"/>
+    <w:bookmarkStart w:id="14" w:name="_Toc209557015" w:displacedByCustomXml="next"/>
+    <w:bookmarkStart w:id="15" w:name="_Toc209592307" w:displacedByCustomXml="next"/>
     <w:sdt>
       <w:sdtPr>
         <w:rPr>
@@ -2976,20 +2938,9 @@
       <w:r>
         <w:t xml:space="preserve"/>
       </w:r>
-      <w:sdt>
-        <w:sdtPr>
-          <w:alias w:val="Company"/>
-          <w:tag w:val="Company"/>
-          <w:id w:val="-1650284372"/>
-          <w:dataBinding w:prefixMappings="xmlns:ns0='http://schemas.openxmlformats.org/officeDocument/2006/extended-properties' " w:xpath="/ns0:Properties[1]/ns0:Company[1]" w:storeItemID="{6668398D-A668-4E3E-A5EB-62B293D839F1}"/>
-          <w:text/>
-        </w:sdtPr>
-        <w:sdtContent>
-          <w:r>
-            <w:t w:space="preserve"/>
-          </w:r>
-        </w:sdtContent>
-      </w:sdt>
+      <w:r>
+        <w:t w:space="preserve"/>
+      </w:r>
       <w:r>
         <w:t xml:space="preserve"/>
       </w:r>
@@ -3002,23 +2953,9 @@
       <w:r>
         <w:t xml:space="preserve"/>
       </w:r>
-      <w:sdt>
-        <w:sdtPr>
-          <w:alias w:val="Company Address"/>
-          <w:tag w:val=""/>
-          <w:id w:val="-299298750"/>
-          <w:placeholder>
-            <w:docPart w:val="054BC73DF7E64A20B9BCAD75FEC9765D"/>
-          </w:placeholder>
-          <w:dataBinding w:prefixMappings="xmlns:ns0='http://schemas.microsoft.com/office/2006/coverPageProps' " w:xpath="/ns0:CoverPageProperties[1]/ns0:CompanyAddress[1]" w:storeItemID="{55AF091B-3C7A-41E3-B477-F2FDAA23CFDA}"/>
-          <w:text/>
-        </w:sdtPr>
-        <w:sdtContent>
-          <w:r>
-            <w:t w:space="preserve"/>
-          </w:r>
-        </w:sdtContent>
-      </w:sdt>
+      <w:r>
+        <w:t w:space="preserve"/>
+      </w:r>
       <w:r>
         <w:t xml:space="preserve"/>
       </w:r>
@@ -3169,20 +3106,9 @@
       <w:r>
         <w:t xml:space="preserve"/>
       </w:r>
-      <w:sdt>
-        <w:sdtPr>
-          <w:alias w:val="Address 1"/>
-          <w:tag w:val="Address 1"/>
-          <w:id w:val="36167234"/>
-          <w:dataBinding w:prefixMappings="xmlns:ns0='http://schemas.microsoft.com/office/2006/coverPageProps' " w:xpath="/ns0:CoverPageProperties[1]/ns0:CompanyAddress[1]" w:storeItemID="{55AF091B-3C7A-41E3-B477-F2FDAA23CFDA}"/>
-          <w:text/>
-        </w:sdtPr>
-        <w:sdtContent>
-          <w:r>
-            <w:t w:space="preserve"/>
-          </w:r>
-        </w:sdtContent>
-      </w:sdt>
+      <w:r>
+        <w:t w:space="preserve"/>
+      </w:r>
       <w:r>
         <w:t/>
       </w:r>
@@ -3210,8 +3136,17 @@
     <w:p>
       <w:pPr>
         <w:spacing w:after="0"/>
-        <w:jc w:val="both"/>
-      </w:pPr>
+        <w:jc w:val="center"/>
+      </w:pPr>
+      <w:r>
+        <w:t w:space="preserve">{#hasSiteImage}</w:t>
+      </w:r>
+      <w:r>
+        <w:t w:space="preserve">{%siteImage}</w:t>
+      </w:r>
+      <w:r>
+        <w:t w:space="preserve">{/hasSiteImage}{^hasSiteImage}[Site image unavailable — {siteImageNote}]{/hasSiteImage}</w:t>
+      </w:r>
     </w:p>
     <w:tbl>
       <w:tblPr>
@@ -3289,20 +3224,9 @@
       <w:r>
         <w:t xml:space="preserve"> site at </w:t>
       </w:r>
-      <w:sdt>
-        <w:sdtPr>
-          <w:alias w:val="Address 1"/>
-          <w:tag w:val="Address 1"/>
-          <w:id w:val="-2060929081"/>
-          <w:dataBinding w:prefixMappings="xmlns:ns0='http://schemas.microsoft.com/office/2006/coverPageProps' " w:xpath="/ns0:CoverPageProperties[1]/ns0:CompanyAddress[1]" w:storeItemID="{55AF091B-3C7A-41E3-B477-F2FDAA23CFDA}"/>
-          <w:text/>
-        </w:sdtPr>
-        <w:sdtContent>
-          <w:r>
-            <w:t w:space="preserve">{projectAddress}</w:t>
-          </w:r>
-        </w:sdtContent>
-      </w:sdt>
+      <w:r>
+        <w:t w:space="preserve">{projectAddress}</w:t>
+      </w:r>
     </w:p>
     <w:p/>
     <w:p>
@@ -3506,6 +3430,12 @@
       <w:tblPr>
         <w:tblStyle w:val="TableGridLight"/>
         <w:tblW w:w="0" w:type="auto"/>
+        <w:tblBorders>
+          <w:top w:val="none" w:sz="0" w:space="0" w:color="auto"/>
+          <w:left w:val="none" w:sz="0" w:space="0" w:color="auto"/>
+          <w:right w:val="none" w:sz="0" w:space="0" w:color="auto"/>
+          <w:insideV w:val="none" w:sz="0" w:space="0" w:color="auto"/>
+        </w:tblBorders>
         <w:tblLook w:val="04A0" w:firstRow="1" w:lastRow="0" w:firstColumn="1" w:lastColumn="0" w:noHBand="0" w:noVBand="1"/>
       </w:tblPr>
       <w:tblGrid>
@@ -3518,21 +3448,24 @@
         <w:tc>
           <w:tcPr>
             <w:tcW w:w="2434" w:type="dxa"/>
+            <w:tcBorders>
+              <w:top w:val="nil"/>
+              <w:bottom w:val="single" w:sz="4" w:space="0" w:color="00602B" w:themeColor="text2"/>
+            </w:tcBorders>
           </w:tcPr>
           <w:p>
             <w:pPr>
-              <w:spacing w:before="0" w:after="200" w:line="276" w:lineRule="auto"/>
-              <w:jc w:val="center"/>
-              <w:rPr>
-                <w:rFonts w:cstheme="minorBidi"/>
-                <w:b/>
+              <w:spacing w:before="60" w:after="60" w:line="240" w:lineRule="auto"/>
+              <w:rPr>
+                <w:rFonts w:ascii="Roboto" w:hAnsi="Roboto" w:cstheme="minorBidi"/>
+                <w:bCs/>
                 <w:color w:val="00602B" w:themeColor="text2"/>
               </w:rPr>
             </w:pPr>
             <w:r>
               <w:rPr>
-                <w:rFonts w:cstheme="minorBidi"/>
-                <w:b/>
+                <w:rFonts w:ascii="Roboto" w:hAnsi="Roboto" w:cstheme="minorBidi"/>
+                <w:bCs/>
                 <w:color w:val="00602B" w:themeColor="text2"/>
               </w:rPr>
               <w:t>Transport System</w:t>
@@ -3542,21 +3475,24 @@
         <w:tc>
           <w:tcPr>
             <w:tcW w:w="2434" w:type="dxa"/>
+            <w:tcBorders>
+              <w:top w:val="nil"/>
+              <w:bottom w:val="single" w:sz="4" w:space="0" w:color="00602B" w:themeColor="text2"/>
+            </w:tcBorders>
           </w:tcPr>
           <w:p>
             <w:pPr>
-              <w:spacing w:before="0" w:after="200" w:line="276" w:lineRule="auto"/>
-              <w:jc w:val="center"/>
-              <w:rPr>
-                <w:rFonts w:cstheme="minorBidi"/>
-                <w:b/>
+              <w:spacing w:before="60" w:after="60" w:line="240" w:lineRule="auto"/>
+              <w:rPr>
+                <w:rFonts w:ascii="Roboto" w:hAnsi="Roboto" w:cstheme="minorBidi"/>
+                <w:bCs/>
                 <w:color w:val="00602B" w:themeColor="text2"/>
               </w:rPr>
             </w:pPr>
             <w:r>
               <w:rPr>
-                <w:rFonts w:cstheme="minorBidi"/>
-                <w:b/>
+                <w:rFonts w:ascii="Roboto" w:hAnsi="Roboto" w:cstheme="minorBidi"/>
+                <w:bCs/>
                 <w:color w:val="00602B" w:themeColor="text2"/>
               </w:rPr>
               <w:t>Closest Stop</w:t>
@@ -3566,21 +3502,24 @@
         <w:tc>
           <w:tcPr>
             <w:tcW w:w="2434" w:type="dxa"/>
+            <w:tcBorders>
+              <w:top w:val="nil"/>
+              <w:bottom w:val="single" w:sz="4" w:space="0" w:color="00602B" w:themeColor="text2"/>
+            </w:tcBorders>
           </w:tcPr>
           <w:p>
             <w:pPr>
-              <w:spacing w:before="0" w:after="200" w:line="276" w:lineRule="auto"/>
-              <w:jc w:val="center"/>
-              <w:rPr>
-                <w:rFonts w:cstheme="minorBidi"/>
-                <w:b/>
+              <w:spacing w:before="60" w:after="60" w:line="240" w:lineRule="auto"/>
+              <w:rPr>
+                <w:rFonts w:ascii="Roboto" w:hAnsi="Roboto" w:cstheme="minorBidi"/>
+                <w:bCs/>
                 <w:color w:val="00602B" w:themeColor="text2"/>
               </w:rPr>
             </w:pPr>
             <w:r>
               <w:rPr>
-                <w:rFonts w:cstheme="minorBidi"/>
-                <w:b/>
+                <w:rFonts w:ascii="Roboto" w:hAnsi="Roboto" w:cstheme="minorBidi"/>
+                <w:bCs/>
                 <w:color w:val="00602B" w:themeColor="text2"/>
               </w:rPr>
               <w:t>Route</w:t>
@@ -3590,21 +3529,24 @@
         <w:tc>
           <w:tcPr>
             <w:tcW w:w="2435" w:type="dxa"/>
+            <w:tcBorders>
+              <w:top w:val="nil"/>
+              <w:bottom w:val="single" w:sz="4" w:space="0" w:color="00602B" w:themeColor="text2"/>
+            </w:tcBorders>
           </w:tcPr>
           <w:p>
             <w:pPr>
-              <w:spacing w:before="0" w:after="200" w:line="276" w:lineRule="auto"/>
-              <w:jc w:val="center"/>
-              <w:rPr>
-                <w:rFonts w:cstheme="minorBidi"/>
-                <w:b/>
+              <w:spacing w:before="60" w:after="60" w:line="240" w:lineRule="auto"/>
+              <w:rPr>
+                <w:rFonts w:ascii="Roboto" w:hAnsi="Roboto" w:cstheme="minorBidi"/>
+                <w:bCs/>
                 <w:color w:val="00602B" w:themeColor="text2"/>
               </w:rPr>
             </w:pPr>
             <w:r>
               <w:rPr>
-                <w:rFonts w:cstheme="minorBidi"/>
-                <w:b/>
+                <w:rFonts w:ascii="Roboto" w:hAnsi="Roboto" w:cstheme="minorBidi"/>
+                <w:bCs/>
                 <w:color w:val="00602B" w:themeColor="text2"/>
               </w:rPr>
               <w:t>Approximate Distance/ Walk Time</w:t>
@@ -3619,11 +3561,13 @@
         <w:tc>
           <w:tcPr>
             <w:tcW w:w="2434" w:type="dxa"/>
+            <w:tcBorders>
+              <w:top w:val="single" w:sz="4" w:space="0" w:color="00602B" w:themeColor="text2"/>
+            </w:tcBorders>
           </w:tcPr>
           <w:p>
             <w:pPr>
-              <w:spacing w:before="0" w:after="200" w:line="276" w:lineRule="auto"/>
-              <w:jc w:val="center"/>
+              <w:spacing w:before="60" w:after="60" w:line="240" w:lineRule="auto"/>
               <w:rPr>
                 <w:rFonts w:cstheme="minorBidi"/>
                 <w:color w:val="auto"/>
@@ -3641,11 +3585,13 @@
         <w:tc>
           <w:tcPr>
             <w:tcW w:w="2434" w:type="dxa"/>
+            <w:tcBorders>
+              <w:top w:val="single" w:sz="4" w:space="0" w:color="00602B" w:themeColor="text2"/>
+            </w:tcBorders>
           </w:tcPr>
           <w:p>
             <w:pPr>
-              <w:spacing w:before="0" w:after="200" w:line="276" w:lineRule="auto"/>
-              <w:jc w:val="center"/>
+              <w:spacing w:before="60" w:after="60" w:line="240" w:lineRule="auto"/>
               <w:rPr>
                 <w:rFonts w:cstheme="minorBidi"/>
                 <w:color w:val="00602B" w:themeColor="text2"/>
@@ -3661,11 +3607,13 @@
         <w:tc>
           <w:tcPr>
             <w:tcW w:w="2434" w:type="dxa"/>
+            <w:tcBorders>
+              <w:top w:val="single" w:sz="4" w:space="0" w:color="00602B" w:themeColor="text2"/>
+            </w:tcBorders>
           </w:tcPr>
           <w:p>
             <w:pPr>
-              <w:spacing w:before="0" w:after="200" w:line="276" w:lineRule="auto"/>
-              <w:jc w:val="center"/>
+              <w:spacing w:before="60" w:after="60" w:line="240" w:lineRule="auto"/>
               <w:rPr>
                 <w:rFonts w:cstheme="minorBidi"/>
                 <w:color w:val="00602B" w:themeColor="text2"/>
@@ -3678,11 +3626,13 @@
         <w:tc>
           <w:tcPr>
             <w:tcW w:w="2435" w:type="dxa"/>
+            <w:tcBorders>
+              <w:top w:val="single" w:sz="4" w:space="0" w:color="00602B" w:themeColor="text2"/>
+            </w:tcBorders>
           </w:tcPr>
           <w:p>
             <w:pPr>
-              <w:spacing w:before="0" w:after="200" w:line="276" w:lineRule="auto"/>
-              <w:jc w:val="center"/>
+              <w:spacing w:before="60" w:after="60" w:line="240" w:lineRule="auto"/>
               <w:rPr>
                 <w:rFonts w:cstheme="minorBidi"/>
                 <w:color w:val="00602B" w:themeColor="text2"/>
@@ -3706,8 +3656,7 @@
           </w:tcPr>
           <w:p>
             <w:pPr>
-              <w:spacing w:before="0" w:after="200" w:line="276" w:lineRule="auto"/>
-              <w:jc w:val="center"/>
+              <w:spacing w:before="60" w:after="60" w:line="240" w:lineRule="auto"/>
               <w:rPr>
                 <w:rFonts w:cstheme="minorBidi"/>
                 <w:color w:val="auto"/>
@@ -3728,8 +3677,7 @@
           </w:tcPr>
           <w:p>
             <w:pPr>
-              <w:spacing w:before="0" w:after="200" w:line="276" w:lineRule="auto"/>
-              <w:jc w:val="center"/>
+              <w:spacing w:before="60" w:after="60" w:line="240" w:lineRule="auto"/>
               <w:rPr>
                 <w:rFonts w:cstheme="minorBidi"/>
                 <w:color w:val="00602B" w:themeColor="text2"/>
@@ -3748,8 +3696,7 @@
           </w:tcPr>
           <w:p>
             <w:pPr>
-              <w:spacing w:before="0" w:after="200" w:line="276" w:lineRule="auto"/>
-              <w:jc w:val="center"/>
+              <w:spacing w:before="60" w:after="60" w:line="240" w:lineRule="auto"/>
               <w:rPr>
                 <w:rFonts w:cstheme="minorBidi"/>
                 <w:color w:val="00602B" w:themeColor="text2"/>
@@ -3765,8 +3712,7 @@
           </w:tcPr>
           <w:p>
             <w:pPr>
-              <w:spacing w:before="0" w:after="200" w:line="276" w:lineRule="auto"/>
-              <w:jc w:val="center"/>
+              <w:spacing w:before="60" w:after="60" w:line="240" w:lineRule="auto"/>
               <w:rPr>
                 <w:rFonts w:cstheme="minorBidi"/>
                 <w:color w:val="00602B" w:themeColor="text2"/>
@@ -3790,8 +3736,7 @@
           </w:tcPr>
           <w:p>
             <w:pPr>
-              <w:spacing w:before="0" w:after="200" w:line="276" w:lineRule="auto"/>
-              <w:jc w:val="center"/>
+              <w:spacing w:before="60" w:after="60" w:line="240" w:lineRule="auto"/>
               <w:rPr>
                 <w:rFonts w:cstheme="minorBidi"/>
                 <w:color w:val="auto"/>
@@ -3812,8 +3757,7 @@
           </w:tcPr>
           <w:p>
             <w:pPr>
-              <w:spacing w:before="0" w:after="200" w:line="276" w:lineRule="auto"/>
-              <w:jc w:val="center"/>
+              <w:spacing w:before="60" w:after="60" w:line="240" w:lineRule="auto"/>
               <w:rPr>
                 <w:rFonts w:cstheme="minorBidi"/>
                 <w:color w:val="00602B" w:themeColor="text2"/>
@@ -3832,8 +3776,7 @@
           </w:tcPr>
           <w:p>
             <w:pPr>
-              <w:spacing w:before="0" w:after="200" w:line="276" w:lineRule="auto"/>
-              <w:jc w:val="center"/>
+              <w:spacing w:before="60" w:after="60" w:line="240" w:lineRule="auto"/>
               <w:rPr>
                 <w:rFonts w:cstheme="minorBidi"/>
                 <w:color w:val="00602B" w:themeColor="text2"/>
@@ -3849,8 +3792,7 @@
           </w:tcPr>
           <w:p>
             <w:pPr>
-              <w:spacing w:before="0" w:after="200" w:line="276" w:lineRule="auto"/>
-              <w:jc w:val="center"/>
+              <w:spacing w:before="60" w:after="60" w:line="240" w:lineRule="auto"/>
               <w:rPr>
                 <w:rFonts w:cstheme="minorBidi"/>
                 <w:color w:val="00602B" w:themeColor="text2"/>
@@ -3917,50 +3859,178 @@
           <w:rFonts w:cstheme="minorBidi"/>
           <w:color w:val="auto"/>
         </w:rPr>
-        <w:t xml:space="preserve">There are several car share services available at the subject site as shown in Figure 3 below. </w:t>
+        <w:t xml:space="preserve">There are several car share services available at the subject site as shown in </w:t>
+      </w:r>
+      <w:r>
+        <w:rPr>
+          <w:rFonts w:cstheme="minorBidi"/>
+          <w:color w:val="auto"/>
+        </w:rPr>
+        <w:t>Table 2</w:t>
+      </w:r>
+      <w:r>
+        <w:rPr>
+          <w:rFonts w:cstheme="minorBidi"/>
+          <w:color w:val="auto"/>
+        </w:rPr>
+        <w:t xml:space="preserve"> below. </w:t>
       </w:r>
     </w:p>
     <w:tbl>
       <w:tblPr>
-        <w:tblStyle w:val="TableGrid4"/>
-        <w:tblW w:w="9749" w:type="dxa"/>
-        <w:jc w:val="center"/>
+        <w:tblStyle w:val="TableGridLight"/>
+        <w:tblW w:w="9918" w:type="dxa"/>
         <w:tblBorders>
           <w:top w:val="none" w:sz="0" w:space="0" w:color="auto"/>
           <w:left w:val="none" w:sz="0" w:space="0" w:color="auto"/>
-          <w:bottom w:val="none" w:sz="0" w:space="0" w:color="auto"/>
           <w:right w:val="none" w:sz="0" w:space="0" w:color="auto"/>
-          <w:insideH w:val="none" w:sz="0" w:space="0" w:color="auto"/>
           <w:insideV w:val="none" w:sz="0" w:space="0" w:color="auto"/>
         </w:tblBorders>
-        <w:tblLayout w:type="fixed"/>
         <w:tblLook w:val="04A0" w:firstRow="1" w:lastRow="0" w:firstColumn="1" w:lastColumn="0" w:noHBand="0" w:noVBand="1"/>
       </w:tblPr>
       <w:tblGrid>
-        <w:gridCol w:w="3402"/>
-        <w:gridCol w:w="3261"/>
-        <w:gridCol w:w="3086"/>
+        <w:gridCol w:w="3306"/>
+        <w:gridCol w:w="3306"/>
+        <w:gridCol w:w="3306"/>
       </w:tblGrid>
       <w:tr>
+        <w:tc>
+          <w:tcPr>
+            <w:tcW w:w="3306" w:type="dxa"/>
+            <w:tcBorders>
+              <w:top w:val="nil"/>
+              <w:bottom w:val="single" w:sz="4" w:space="0" w:color="00602B" w:themeColor="text2"/>
+            </w:tcBorders>
+          </w:tcPr>
+          <w:p>
+            <w:pPr>
+              <w:spacing w:before="60" w:after="60" w:line="240" w:lineRule="auto"/>
+              <w:rPr>
+                <w:rFonts w:ascii="Roboto" w:hAnsi="Roboto" w:cstheme="minorBidi"/>
+                <w:bCs/>
+                <w:color w:val="00602B" w:themeColor="text2"/>
+              </w:rPr>
+            </w:pPr>
+            <w:r>
+              <w:rPr>
+                <w:rFonts w:ascii="Roboto" w:hAnsi="Roboto" w:cstheme="minorBidi"/>
+                <w:bCs/>
+                <w:color w:val="00602B" w:themeColor="text2"/>
+              </w:rPr>
+              <w:t>Car Share Provider</w:t>
+            </w:r>
+          </w:p>
+        </w:tc>
+        <w:tc>
+          <w:tcPr>
+            <w:tcW w:w="3306" w:type="dxa"/>
+            <w:tcBorders>
+              <w:top w:val="nil"/>
+              <w:bottom w:val="single" w:sz="4" w:space="0" w:color="00602B" w:themeColor="text2"/>
+            </w:tcBorders>
+          </w:tcPr>
+          <w:p>
+            <w:pPr>
+              <w:spacing w:before="60" w:after="60" w:line="240" w:lineRule="auto"/>
+              <w:rPr>
+                <w:rFonts w:ascii="Roboto" w:hAnsi="Roboto" w:cstheme="minorBidi"/>
+                <w:bCs/>
+                <w:color w:val="00602B" w:themeColor="text2"/>
+              </w:rPr>
+            </w:pPr>
+            <w:r>
+              <w:rPr>
+                <w:rFonts w:ascii="Roboto" w:hAnsi="Roboto" w:cstheme="minorBidi"/>
+                <w:bCs/>
+                <w:color w:val="00602B" w:themeColor="text2"/>
+              </w:rPr>
+              <w:t>Location</w:t>
+            </w:r>
+          </w:p>
+        </w:tc>
+        <w:tc>
+          <w:tcPr>
+            <w:tcW w:w="3306" w:type="dxa"/>
+            <w:tcBorders>
+              <w:top w:val="nil"/>
+              <w:bottom w:val="single" w:sz="4" w:space="0" w:color="00602B" w:themeColor="text2"/>
+            </w:tcBorders>
+          </w:tcPr>
+          <w:p>
+            <w:pPr>
+              <w:spacing w:before="60" w:after="60" w:line="240" w:lineRule="auto"/>
+              <w:rPr>
+                <w:rFonts w:ascii="Roboto" w:hAnsi="Roboto" w:cstheme="minorBidi"/>
+                <w:bCs/>
+                <w:color w:val="00602B" w:themeColor="text2"/>
+              </w:rPr>
+            </w:pPr>
+            <w:r>
+              <w:rPr>
+                <w:rFonts w:ascii="Roboto" w:hAnsi="Roboto" w:cstheme="minorBidi"/>
+                <w:bCs/>
+                <w:color w:val="00602B" w:themeColor="text2"/>
+              </w:rPr>
+              <w:t>Approximate Distance/ Walk Time</w:t>
+            </w:r>
+          </w:p>
+        </w:tc>
+      </w:tr>
+      <w:tr>
         <w:trPr>
-          <w:trHeight w:hRule="exact" w:val="4924"/>
-          <w:jc w:val="center"/>
+          <w:trHeight w:val="518"/>
         </w:trPr>
         <w:tc>
           <w:tcPr>
-            <w:tcW w:w="9749" w:type="dxa"/>
-            <w:gridSpan w:val="3"/>
-            <w:vAlign w:val="center"/>
+            <w:tcW w:w="3306" w:type="dxa"/>
+            <w:tcBorders>
+              <w:top w:val="single" w:sz="4" w:space="0" w:color="00602B" w:themeColor="text2"/>
+            </w:tcBorders>
           </w:tcPr>
           <w:p>
             <w:pPr>
-              <w:spacing w:before="0" w:after="200" w:line="276" w:lineRule="auto"/>
-              <w:jc w:val="center"/>
-              <w:rPr>
-                <w:rFonts w:eastAsiaTheme="minorEastAsia" w:cstheme="minorBidi"/>
+              <w:spacing w:before="60" w:after="60" w:line="240" w:lineRule="auto"/>
+              <w:rPr>
+                <w:rFonts w:cstheme="minorBidi"/>
                 <w:color w:val="auto"/>
-                <w:szCs w:val="22"/>
-                <w:lang w:eastAsia="en-US"/>
+              </w:rPr>
+            </w:pPr>
+          </w:p>
+        </w:tc>
+        <w:tc>
+          <w:tcPr>
+            <w:tcW w:w="3306" w:type="dxa"/>
+            <w:tcBorders>
+              <w:top w:val="single" w:sz="4" w:space="0" w:color="00602B" w:themeColor="text2"/>
+            </w:tcBorders>
+          </w:tcPr>
+          <w:p>
+            <w:pPr>
+              <w:spacing w:before="60" w:after="60" w:line="240" w:lineRule="auto"/>
+              <w:rPr>
+                <w:rFonts w:cstheme="minorBidi"/>
+                <w:color w:val="00602B" w:themeColor="text2"/>
+                <w:sz w:val="26"/>
+                <w:szCs w:val="26"/>
+              </w:rPr>
+            </w:pPr>
+          </w:p>
+        </w:tc>
+        <w:tc>
+          <w:tcPr>
+            <w:tcW w:w="3306" w:type="dxa"/>
+            <w:tcBorders>
+              <w:top w:val="single" w:sz="4" w:space="0" w:color="00602B" w:themeColor="text2"/>
+            </w:tcBorders>
+          </w:tcPr>
+          <w:p>
+            <w:pPr>
+              <w:spacing w:before="60" w:after="60" w:line="240" w:lineRule="auto"/>
+              <w:rPr>
+                <w:rFonts w:cstheme="minorBidi"/>
+                <w:color w:val="00602B" w:themeColor="text2"/>
+                <w:sz w:val="26"/>
+                <w:szCs w:val="26"/>
               </w:rPr>
             </w:pPr>
           </w:p>
@@ -3968,347 +4038,115 @@
       </w:tr>
       <w:tr>
         <w:trPr>
-          <w:trHeight w:val="213"/>
-          <w:jc w:val="center"/>
+          <w:trHeight w:val="480"/>
         </w:trPr>
         <w:tc>
           <w:tcPr>
-            <w:tcW w:w="9749" w:type="dxa"/>
-            <w:gridSpan w:val="3"/>
-            <w:vAlign w:val="center"/>
+            <w:tcW w:w="3306" w:type="dxa"/>
           </w:tcPr>
           <w:p>
             <w:pPr>
-              <w:spacing w:before="0" w:after="200" w:line="276" w:lineRule="auto"/>
-              <w:rPr>
-                <w:rFonts w:eastAsiaTheme="minorEastAsia" w:cstheme="minorBidi"/>
+              <w:spacing w:before="60" w:after="60" w:line="240" w:lineRule="auto"/>
+              <w:rPr>
+                <w:rFonts w:cstheme="minorBidi"/>
                 <w:color w:val="auto"/>
-                <w:szCs w:val="22"/>
-                <w:lang w:eastAsia="en-US"/>
               </w:rPr>
             </w:pPr>
-            <w:r>
-              <w:rPr>
-                <w:rFonts w:eastAsiaTheme="minorEastAsia" w:cstheme="minorBidi"/>
+          </w:p>
+        </w:tc>
+        <w:tc>
+          <w:tcPr>
+            <w:tcW w:w="3306" w:type="dxa"/>
+          </w:tcPr>
+          <w:p>
+            <w:pPr>
+              <w:spacing w:before="60" w:after="60" w:line="240" w:lineRule="auto"/>
+              <w:rPr>
+                <w:rFonts w:cstheme="minorBidi"/>
                 <w:color w:val="00602B" w:themeColor="text2"/>
-                <w:szCs w:val="22"/>
-                <w:lang w:eastAsia="en-US"/>
-              </w:rPr>
-              <w:t>Car Share Scheme</w:t>
-            </w:r>
+                <w:sz w:val="26"/>
+                <w:szCs w:val="26"/>
+              </w:rPr>
+            </w:pPr>
+          </w:p>
+        </w:tc>
+        <w:tc>
+          <w:tcPr>
+            <w:tcW w:w="3306" w:type="dxa"/>
+          </w:tcPr>
+          <w:p>
+            <w:pPr>
+              <w:spacing w:before="60" w:after="60" w:line="240" w:lineRule="auto"/>
+              <w:rPr>
+                <w:rFonts w:cstheme="minorBidi"/>
+                <w:color w:val="00602B" w:themeColor="text2"/>
+                <w:sz w:val="26"/>
+                <w:szCs w:val="26"/>
+              </w:rPr>
+            </w:pPr>
           </w:p>
         </w:tc>
       </w:tr>
       <w:tr>
         <w:trPr>
-          <w:trHeight w:val="1797"/>
-          <w:jc w:val="center"/>
+          <w:trHeight w:val="442"/>
         </w:trPr>
         <w:tc>
           <w:tcPr>
-            <w:tcW w:w="3402" w:type="dxa"/>
-            <w:vAlign w:val="center"/>
+            <w:tcW w:w="3306" w:type="dxa"/>
           </w:tcPr>
           <w:p>
             <w:pPr>
-              <w:spacing w:before="0" w:after="200" w:line="276" w:lineRule="auto"/>
-              <w:jc w:val="center"/>
-              <w:rPr>
-                <w:rFonts w:eastAsiaTheme="minorEastAsia" w:cstheme="minorBidi"/>
+              <w:spacing w:before="60" w:after="60" w:line="240" w:lineRule="auto"/>
+              <w:rPr>
+                <w:rFonts w:cstheme="minorBidi"/>
                 <w:color w:val="auto"/>
-                <w:szCs w:val="22"/>
-                <w:lang w:eastAsia="en-US"/>
-              </w:rPr>
-            </w:pPr>
-          </w:p>
-          <w:p>
-            <w:pPr>
-              <w:spacing w:before="0" w:after="200" w:line="276" w:lineRule="auto"/>
-              <w:jc w:val="center"/>
-              <w:rPr>
-                <w:rFonts w:eastAsiaTheme="minorEastAsia" w:cstheme="minorBidi"/>
-                <w:color w:val="auto"/>
-                <w:szCs w:val="22"/>
-                <w:lang w:eastAsia="en-US"/>
-              </w:rPr>
-            </w:pPr>
-            <w:r>
-              <w:rPr>
-                <w:rFonts w:cstheme="minorBidi"/>
-                <w:noProof/>
-                <w:color w:val="auto"/>
-              </w:rPr>
-              <w:drawing>
-                <wp:inline distT="0" distB="0" distL="0" distR="0" wp14:anchorId="76CF7FD5" wp14:editId="11681255">
-                  <wp:extent cx="437712" cy="372108"/>
-                  <wp:effectExtent l="0" t="0" r="635" b="9525"/>
-                  <wp:docPr id="237922315" name="Picture 237922315"/>
-                  <wp:cNvGraphicFramePr>
-                    <a:graphicFrameLocks xmlns:a="http://schemas.openxmlformats.org/drawingml/2006/main" noChangeAspect="1"/>
-                  </wp:cNvGraphicFramePr>
-                  <a:graphic xmlns:a="http://schemas.openxmlformats.org/drawingml/2006/main">
-                    <a:graphicData uri="http://schemas.openxmlformats.org/drawingml/2006/picture">
-                      <pic:pic xmlns:pic="http://schemas.openxmlformats.org/drawingml/2006/picture">
-                        <pic:nvPicPr>
-                          <pic:cNvPr id="5" name="Flexicar.png"/>
-                          <pic:cNvPicPr/>
-                        </pic:nvPicPr>
-                        <pic:blipFill>
-                          <a:blip r:embed="rId13" cstate="print">
-                            <a:extLst>
-                              <a:ext uri="{28A0092B-C50C-407E-A947-70E740481C1C}">
-                                <a14:useLocalDpi xmlns:a14="http://schemas.microsoft.com/office/drawing/2010/main" val="0"/>
-                              </a:ext>
-                            </a:extLst>
-                          </a:blip>
-                          <a:stretch>
-                            <a:fillRect/>
-                          </a:stretch>
-                        </pic:blipFill>
-                        <pic:spPr>
-                          <a:xfrm>
-                            <a:off x="0" y="0"/>
-                            <a:ext cx="444400" cy="377794"/>
-                          </a:xfrm>
-                          <a:prstGeom prst="rect">
-                            <a:avLst/>
-                          </a:prstGeom>
-                        </pic:spPr>
-                      </pic:pic>
-                    </a:graphicData>
-                  </a:graphic>
-                </wp:inline>
-              </w:drawing>
-            </w:r>
-          </w:p>
-          <w:p>
-            <w:pPr>
-              <w:spacing w:before="0" w:after="200" w:line="276" w:lineRule="auto"/>
-              <w:jc w:val="center"/>
-              <w:rPr>
-                <w:rFonts w:eastAsiaTheme="minorEastAsia" w:cstheme="minorBidi"/>
-                <w:color w:val="auto"/>
-                <w:szCs w:val="22"/>
-                <w:lang w:eastAsia="en-US"/>
-              </w:rPr>
-            </w:pPr>
-            <w:proofErr w:type="spellStart"/>
-            <w:r>
-              <w:rPr>
-                <w:rFonts w:eastAsiaTheme="minorEastAsia" w:cstheme="minorBidi"/>
-                <w:color w:val="auto"/>
-                <w:szCs w:val="22"/>
-                <w:lang w:eastAsia="en-US"/>
-              </w:rPr>
-              <w:t>Flexicar</w:t>
-            </w:r>
-            <w:proofErr w:type="spellEnd"/>
-          </w:p>
-          <w:p>
-            <w:pPr>
-              <w:spacing w:before="0" w:after="200" w:line="276" w:lineRule="auto"/>
-              <w:jc w:val="center"/>
-              <w:rPr>
-                <w:rFonts w:eastAsiaTheme="minorEastAsia" w:cstheme="minorBidi"/>
-                <w:color w:val="auto"/>
-                <w:szCs w:val="22"/>
-                <w:lang w:eastAsia="en-US"/>
               </w:rPr>
             </w:pPr>
           </w:p>
         </w:tc>
         <w:tc>
           <w:tcPr>
-            <w:tcW w:w="3261" w:type="dxa"/>
-            <w:vAlign w:val="center"/>
+            <w:tcW w:w="3306" w:type="dxa"/>
           </w:tcPr>
           <w:p>
             <w:pPr>
-              <w:spacing w:before="0" w:after="200" w:line="276" w:lineRule="auto"/>
-              <w:jc w:val="center"/>
-              <w:rPr>
-                <w:rFonts w:eastAsiaTheme="minorEastAsia" w:cstheme="minorBidi"/>
-                <w:color w:val="auto"/>
-                <w:szCs w:val="22"/>
-                <w:lang w:eastAsia="en-US"/>
+              <w:spacing w:before="60" w:after="60" w:line="240" w:lineRule="auto"/>
+              <w:rPr>
+                <w:rFonts w:cstheme="minorBidi"/>
+                <w:color w:val="00602B" w:themeColor="text2"/>
+                <w:sz w:val="26"/>
+                <w:szCs w:val="26"/>
               </w:rPr>
             </w:pPr>
-            <w:r>
-              <w:rPr>
-                <w:rFonts w:cstheme="minorBidi"/>
-                <w:noProof/>
-                <w:color w:val="auto"/>
-              </w:rPr>
-              <w:drawing>
-                <wp:inline distT="0" distB="0" distL="0" distR="0" wp14:anchorId="6093F568" wp14:editId="273A8F45">
-                  <wp:extent cx="430840" cy="356899"/>
-                  <wp:effectExtent l="0" t="0" r="7620" b="5080"/>
-                  <wp:docPr id="489947514" name="Picture 489947514"/>
-                  <wp:cNvGraphicFramePr>
-                    <a:graphicFrameLocks xmlns:a="http://schemas.openxmlformats.org/drawingml/2006/main" noChangeAspect="1"/>
-                  </wp:cNvGraphicFramePr>
-                  <a:graphic xmlns:a="http://schemas.openxmlformats.org/drawingml/2006/main">
-                    <a:graphicData uri="http://schemas.openxmlformats.org/drawingml/2006/picture">
-                      <pic:pic xmlns:pic="http://schemas.openxmlformats.org/drawingml/2006/picture">
-                        <pic:nvPicPr>
-                          <pic:cNvPr id="8" name="goget car.png"/>
-                          <pic:cNvPicPr/>
-                        </pic:nvPicPr>
-                        <pic:blipFill>
-                          <a:blip r:embed="rId14" cstate="print">
-                            <a:extLst>
-                              <a:ext uri="{28A0092B-C50C-407E-A947-70E740481C1C}">
-                                <a14:useLocalDpi xmlns:a14="http://schemas.microsoft.com/office/drawing/2010/main" val="0"/>
-                              </a:ext>
-                            </a:extLst>
-                          </a:blip>
-                          <a:stretch>
-                            <a:fillRect/>
-                          </a:stretch>
-                        </pic:blipFill>
-                        <pic:spPr>
-                          <a:xfrm>
-                            <a:off x="0" y="0"/>
-                            <a:ext cx="435557" cy="360807"/>
-                          </a:xfrm>
-                          <a:prstGeom prst="rect">
-                            <a:avLst/>
-                          </a:prstGeom>
-                        </pic:spPr>
-                      </pic:pic>
-                    </a:graphicData>
-                  </a:graphic>
-                </wp:inline>
-              </w:drawing>
-            </w:r>
-          </w:p>
-          <w:p>
-            <w:pPr>
-              <w:spacing w:before="0" w:after="200" w:line="276" w:lineRule="auto"/>
-              <w:jc w:val="center"/>
-              <w:rPr>
-                <w:rFonts w:eastAsiaTheme="minorEastAsia" w:cstheme="minorBidi"/>
-                <w:color w:val="auto"/>
-                <w:szCs w:val="22"/>
-                <w:lang w:eastAsia="en-US"/>
-              </w:rPr>
-            </w:pPr>
-            <w:r>
-              <w:rPr>
-                <w:rFonts w:eastAsiaTheme="minorEastAsia" w:cstheme="minorBidi"/>
-                <w:color w:val="auto"/>
-                <w:szCs w:val="22"/>
-                <w:lang w:eastAsia="en-US"/>
-              </w:rPr>
-              <w:t>GoGet Car Share</w:t>
-            </w:r>
           </w:p>
         </w:tc>
         <w:tc>
           <w:tcPr>
-            <w:tcW w:w="3086" w:type="dxa"/>
-            <w:vAlign w:val="center"/>
+            <w:tcW w:w="3306" w:type="dxa"/>
           </w:tcPr>
           <w:p>
             <w:pPr>
-              <w:spacing w:before="0" w:after="200" w:line="276" w:lineRule="auto"/>
-              <w:jc w:val="center"/>
-              <w:rPr>
-                <w:rFonts w:eastAsiaTheme="minorEastAsia" w:cstheme="minorBidi"/>
-                <w:color w:val="auto"/>
-                <w:szCs w:val="22"/>
-                <w:lang w:eastAsia="en-US"/>
+              <w:spacing w:before="60" w:after="60" w:line="240" w:lineRule="auto"/>
+              <w:rPr>
+                <w:rFonts w:cstheme="minorBidi"/>
+                <w:color w:val="00602B" w:themeColor="text2"/>
+                <w:sz w:val="26"/>
+                <w:szCs w:val="26"/>
               </w:rPr>
             </w:pPr>
-            <w:r>
-              <w:rPr>
-                <w:rFonts w:cstheme="minorBidi"/>
-                <w:noProof/>
-                <w:color w:val="auto"/>
-              </w:rPr>
-              <w:drawing>
-                <wp:inline distT="0" distB="0" distL="0" distR="0" wp14:anchorId="0C97008B" wp14:editId="11936962">
-                  <wp:extent cx="435236" cy="360541"/>
-                  <wp:effectExtent l="0" t="0" r="3175" b="1905"/>
-                  <wp:docPr id="2071875493" name="Picture 2071875493"/>
-                  <wp:cNvGraphicFramePr>
-                    <a:graphicFrameLocks xmlns:a="http://schemas.openxmlformats.org/drawingml/2006/main" noChangeAspect="1"/>
-                  </wp:cNvGraphicFramePr>
-                  <a:graphic xmlns:a="http://schemas.openxmlformats.org/drawingml/2006/main">
-                    <a:graphicData uri="http://schemas.openxmlformats.org/drawingml/2006/picture">
-                      <pic:pic xmlns:pic="http://schemas.openxmlformats.org/drawingml/2006/picture">
-                        <pic:nvPicPr>
-                          <pic:cNvPr id="9" name="green share.png"/>
-                          <pic:cNvPicPr/>
-                        </pic:nvPicPr>
-                        <pic:blipFill>
-                          <a:blip r:embed="rId15" cstate="print">
-                            <a:extLst>
-                              <a:ext uri="{28A0092B-C50C-407E-A947-70E740481C1C}">
-                                <a14:useLocalDpi xmlns:a14="http://schemas.microsoft.com/office/drawing/2010/main" val="0"/>
-                              </a:ext>
-                            </a:extLst>
-                          </a:blip>
-                          <a:stretch>
-                            <a:fillRect/>
-                          </a:stretch>
-                        </pic:blipFill>
-                        <pic:spPr>
-                          <a:xfrm>
-                            <a:off x="0" y="0"/>
-                            <a:ext cx="439131" cy="363767"/>
-                          </a:xfrm>
-                          <a:prstGeom prst="rect">
-                            <a:avLst/>
-                          </a:prstGeom>
-                        </pic:spPr>
-                      </pic:pic>
-                    </a:graphicData>
-                  </a:graphic>
-                </wp:inline>
-              </w:drawing>
-            </w:r>
-          </w:p>
-          <w:p>
-            <w:pPr>
-              <w:spacing w:before="0" w:after="200" w:line="276" w:lineRule="auto"/>
-              <w:jc w:val="center"/>
-              <w:rPr>
-                <w:rFonts w:eastAsiaTheme="minorEastAsia" w:cstheme="minorBidi"/>
-                <w:color w:val="auto"/>
-                <w:szCs w:val="22"/>
-                <w:lang w:eastAsia="en-US"/>
-              </w:rPr>
-            </w:pPr>
-            <w:r>
-              <w:rPr>
-                <w:rFonts w:eastAsiaTheme="minorEastAsia" w:cstheme="minorBidi"/>
-                <w:color w:val="auto"/>
-                <w:szCs w:val="22"/>
-                <w:lang w:eastAsia="en-US"/>
-              </w:rPr>
-              <w:t>Green Share Car</w:t>
-            </w:r>
           </w:p>
         </w:tc>
       </w:tr>
     </w:tbl>
     <w:p>
       <w:pPr>
-        <w:pStyle w:val="Caption"/>
-        <w:jc w:val="center"/>
+        <w:spacing w:before="0" w:after="200" w:line="276" w:lineRule="auto"/>
         <w:rPr>
-          <w:rFonts w:eastAsia="Times New Roman"/>
-          <w:lang w:eastAsia="en-AU"/>
+          <w:rFonts w:cstheme="minorBidi"/>
+          <w:color w:val="auto"/>
         </w:rPr>
       </w:pPr>
-      <w:r>
-        <w:rPr>
-          <w:rFonts w:eastAsia="Times New Roman"/>
-          <w:lang w:eastAsia="en-AU"/>
-        </w:rPr>
-        <w:t xml:space="preserve">Figure 3: Car Share </w:t>
-      </w:r>
     </w:p>
     <w:p>
       <w:pPr>
@@ -4436,6 +4274,12 @@
       <w:tblPr>
         <w:tblStyle w:val="TableGridLight"/>
         <w:tblW w:w="0" w:type="auto"/>
+        <w:tblBorders>
+          <w:top w:val="none" w:sz="0" w:space="0" w:color="auto"/>
+          <w:left w:val="none" w:sz="0" w:space="0" w:color="auto"/>
+          <w:right w:val="none" w:sz="0" w:space="0" w:color="auto"/>
+          <w:insideV w:val="none" w:sz="0" w:space="0" w:color="auto"/>
+        </w:tblBorders>
         <w:tblLook w:val="04A0" w:firstRow="1" w:lastRow="0" w:firstColumn="1" w:lastColumn="0" w:noHBand="0" w:noVBand="1"/>
       </w:tblPr>
       <w:tblGrid>
@@ -4445,27 +4289,30 @@
       </w:tblGrid>
       <w:tr>
         <w:trPr>
-          <w:trHeight w:val="508"/>
+          <w:trHeight w:val="384"/>
         </w:trPr>
         <w:tc>
           <w:tcPr>
             <w:tcW w:w="3407" w:type="dxa"/>
+            <w:tcBorders>
+              <w:top w:val="nil"/>
+              <w:bottom w:val="single" w:sz="4" w:space="0" w:color="00602B" w:themeColor="text2"/>
+            </w:tcBorders>
           </w:tcPr>
           <w:p>
             <w:pPr>
-              <w:spacing w:before="0" w:after="200" w:line="276" w:lineRule="auto"/>
-              <w:jc w:val="center"/>
-              <w:rPr>
-                <w:rFonts w:cstheme="minorBidi"/>
-                <w:b/>
-                <w:color w:val="00883C" w:themeColor="text2" w:themeTint="E6"/>
+              <w:spacing w:before="60" w:after="60" w:line="276" w:lineRule="auto"/>
+              <w:rPr>
+                <w:rFonts w:ascii="Roboto" w:hAnsi="Roboto" w:cstheme="minorBidi"/>
+                <w:bCs/>
+                <w:color w:val="00602B" w:themeColor="text2"/>
               </w:rPr>
             </w:pPr>
             <w:r>
               <w:rPr>
-                <w:rFonts w:cstheme="minorBidi"/>
-                <w:b/>
-                <w:color w:val="00883C" w:themeColor="text2" w:themeTint="E6"/>
+                <w:rFonts w:ascii="Roboto" w:hAnsi="Roboto" w:cstheme="minorBidi"/>
+                <w:bCs/>
+                <w:color w:val="00602B" w:themeColor="text2"/>
               </w:rPr>
               <w:t>Taxi</w:t>
             </w:r>
@@ -4474,22 +4321,25 @@
         <w:tc>
           <w:tcPr>
             <w:tcW w:w="3346" w:type="dxa"/>
+            <w:tcBorders>
+              <w:top w:val="nil"/>
+              <w:bottom w:val="single" w:sz="4" w:space="0" w:color="00602B" w:themeColor="text2"/>
+            </w:tcBorders>
           </w:tcPr>
           <w:p>
             <w:pPr>
-              <w:spacing w:before="0" w:after="200" w:line="276" w:lineRule="auto"/>
-              <w:jc w:val="center"/>
-              <w:rPr>
-                <w:rFonts w:cstheme="minorBidi"/>
-                <w:b/>
-                <w:color w:val="00883C" w:themeColor="text2" w:themeTint="E6"/>
+              <w:spacing w:before="60" w:after="60" w:line="276" w:lineRule="auto"/>
+              <w:rPr>
+                <w:rFonts w:ascii="Roboto" w:hAnsi="Roboto" w:cstheme="minorBidi"/>
+                <w:bCs/>
+                <w:color w:val="00602B" w:themeColor="text2"/>
               </w:rPr>
             </w:pPr>
             <w:r>
               <w:rPr>
-                <w:rFonts w:cstheme="minorBidi"/>
-                <w:b/>
-                <w:color w:val="00883C" w:themeColor="text2" w:themeTint="E6"/>
+                <w:rFonts w:ascii="Roboto" w:hAnsi="Roboto" w:cstheme="minorBidi"/>
+                <w:bCs/>
+                <w:color w:val="00602B" w:themeColor="text2"/>
               </w:rPr>
               <w:t>Contact Details</w:t>
             </w:r>
@@ -4498,22 +4348,25 @@
         <w:tc>
           <w:tcPr>
             <w:tcW w:w="2984" w:type="dxa"/>
+            <w:tcBorders>
+              <w:top w:val="nil"/>
+              <w:bottom w:val="single" w:sz="4" w:space="0" w:color="00602B" w:themeColor="text2"/>
+            </w:tcBorders>
           </w:tcPr>
           <w:p>
             <w:pPr>
-              <w:spacing w:before="0" w:after="200" w:line="276" w:lineRule="auto"/>
-              <w:jc w:val="center"/>
-              <w:rPr>
-                <w:rFonts w:cstheme="minorBidi"/>
-                <w:b/>
-                <w:color w:val="00883C" w:themeColor="text2" w:themeTint="E6"/>
+              <w:spacing w:before="60" w:after="60" w:line="276" w:lineRule="auto"/>
+              <w:rPr>
+                <w:rFonts w:ascii="Roboto" w:hAnsi="Roboto" w:cstheme="minorBidi"/>
+                <w:bCs/>
+                <w:color w:val="00602B" w:themeColor="text2"/>
               </w:rPr>
             </w:pPr>
             <w:r>
               <w:rPr>
-                <w:rFonts w:cstheme="minorBidi"/>
-                <w:b/>
-                <w:color w:val="00883C" w:themeColor="text2" w:themeTint="E6"/>
+                <w:rFonts w:ascii="Roboto" w:hAnsi="Roboto" w:cstheme="minorBidi"/>
+                <w:bCs/>
+                <w:color w:val="00602B" w:themeColor="text2"/>
               </w:rPr>
               <w:t>Wheelchair Access</w:t>
             </w:r>
@@ -4527,11 +4380,13 @@
         <w:tc>
           <w:tcPr>
             <w:tcW w:w="3407" w:type="dxa"/>
+            <w:tcBorders>
+              <w:top w:val="single" w:sz="4" w:space="0" w:color="00602B" w:themeColor="text2"/>
+            </w:tcBorders>
           </w:tcPr>
           <w:p>
             <w:pPr>
-              <w:spacing w:before="0" w:after="200" w:line="276" w:lineRule="auto"/>
-              <w:jc w:val="center"/>
+              <w:spacing w:before="60" w:after="60" w:line="276" w:lineRule="auto"/>
               <w:rPr>
                 <w:rFonts w:cstheme="minorBidi"/>
                 <w:color w:val="auto"/>
@@ -4549,11 +4404,13 @@
         <w:tc>
           <w:tcPr>
             <w:tcW w:w="3346" w:type="dxa"/>
+            <w:tcBorders>
+              <w:top w:val="single" w:sz="4" w:space="0" w:color="00602B" w:themeColor="text2"/>
+            </w:tcBorders>
           </w:tcPr>
           <w:p>
             <w:pPr>
-              <w:spacing w:before="0" w:after="200" w:line="276" w:lineRule="auto"/>
-              <w:jc w:val="center"/>
+              <w:spacing w:before="60" w:after="60" w:line="276" w:lineRule="auto"/>
               <w:rPr>
                 <w:rFonts w:cstheme="minorBidi"/>
                 <w:color w:val="auto"/>
@@ -4571,11 +4428,13 @@
         <w:tc>
           <w:tcPr>
             <w:tcW w:w="2984" w:type="dxa"/>
+            <w:tcBorders>
+              <w:top w:val="single" w:sz="4" w:space="0" w:color="00602B" w:themeColor="text2"/>
+            </w:tcBorders>
           </w:tcPr>
           <w:p>
             <w:pPr>
-              <w:spacing w:before="0" w:after="200" w:line="276" w:lineRule="auto"/>
-              <w:jc w:val="center"/>
+              <w:spacing w:before="60" w:after="60" w:line="276" w:lineRule="auto"/>
               <w:rPr>
                 <w:rFonts w:cstheme="minorBidi"/>
                 <w:color w:val="auto"/>
@@ -4601,8 +4460,7 @@
           </w:tcPr>
           <w:p>
             <w:pPr>
-              <w:spacing w:before="0" w:after="200" w:line="276" w:lineRule="auto"/>
-              <w:jc w:val="center"/>
+              <w:spacing w:before="60" w:after="60" w:line="276" w:lineRule="auto"/>
               <w:rPr>
                 <w:rFonts w:cstheme="minorBidi"/>
                 <w:color w:val="auto"/>
@@ -4623,8 +4481,7 @@
           </w:tcPr>
           <w:p>
             <w:pPr>
-              <w:spacing w:before="0" w:after="200" w:line="276" w:lineRule="auto"/>
-              <w:jc w:val="center"/>
+              <w:spacing w:before="60" w:after="60" w:line="276" w:lineRule="auto"/>
               <w:rPr>
                 <w:rFonts w:cstheme="minorBidi"/>
                 <w:color w:val="auto"/>
@@ -4645,8 +4502,7 @@
           </w:tcPr>
           <w:p>
             <w:pPr>
-              <w:spacing w:before="0" w:after="200" w:line="276" w:lineRule="auto"/>
-              <w:jc w:val="center"/>
+              <w:spacing w:before="60" w:after="60" w:line="276" w:lineRule="auto"/>
               <w:rPr>
                 <w:rFonts w:cstheme="minorBidi"/>
                 <w:color w:val="auto"/>
@@ -4672,8 +4528,7 @@
           </w:tcPr>
           <w:p>
             <w:pPr>
-              <w:spacing w:before="0" w:after="200" w:line="276" w:lineRule="auto"/>
-              <w:jc w:val="center"/>
+              <w:spacing w:before="60" w:after="60" w:line="276" w:lineRule="auto"/>
               <w:rPr>
                 <w:rFonts w:cstheme="minorBidi"/>
                 <w:color w:val="auto"/>
@@ -4694,8 +4549,7 @@
           </w:tcPr>
           <w:p>
             <w:pPr>
-              <w:spacing w:before="0" w:after="200" w:line="276" w:lineRule="auto"/>
-              <w:jc w:val="center"/>
+              <w:spacing w:before="60" w:after="60" w:line="276" w:lineRule="auto"/>
               <w:rPr>
                 <w:rFonts w:cstheme="minorBidi"/>
                 <w:color w:val="auto"/>
@@ -4716,8 +4570,7 @@
           </w:tcPr>
           <w:p>
             <w:pPr>
-              <w:spacing w:before="0" w:after="200" w:line="276" w:lineRule="auto"/>
-              <w:jc w:val="center"/>
+              <w:spacing w:before="60" w:after="60" w:line="276" w:lineRule="auto"/>
               <w:rPr>
                 <w:rFonts w:cstheme="minorBidi"/>
                 <w:color w:val="auto"/>
@@ -4743,8 +4596,7 @@
           </w:tcPr>
           <w:p>
             <w:pPr>
-              <w:spacing w:before="0" w:after="200" w:line="276" w:lineRule="auto"/>
-              <w:jc w:val="center"/>
+              <w:spacing w:before="60" w:after="60" w:line="276" w:lineRule="auto"/>
               <w:rPr>
                 <w:rFonts w:cstheme="minorBidi"/>
                 <w:color w:val="auto"/>
@@ -4765,8 +4617,7 @@
           </w:tcPr>
           <w:p>
             <w:pPr>
-              <w:spacing w:before="0" w:after="200" w:line="276" w:lineRule="auto"/>
-              <w:jc w:val="center"/>
+              <w:spacing w:before="60" w:after="60" w:line="276" w:lineRule="auto"/>
               <w:rPr>
                 <w:rFonts w:cstheme="minorBidi"/>
                 <w:color w:val="auto"/>
@@ -4787,8 +4638,7 @@
           </w:tcPr>
           <w:p>
             <w:pPr>
-              <w:spacing w:before="0" w:after="200" w:line="276" w:lineRule="auto"/>
-              <w:jc w:val="center"/>
+              <w:spacing w:before="60" w:after="60" w:line="276" w:lineRule="auto"/>
               <w:rPr>
                 <w:rFonts w:cstheme="minorBidi"/>
                 <w:color w:val="auto"/>
@@ -4814,8 +4664,7 @@
           </w:tcPr>
           <w:p>
             <w:pPr>
-              <w:spacing w:before="0" w:after="200" w:line="276" w:lineRule="auto"/>
-              <w:jc w:val="center"/>
+              <w:spacing w:before="60" w:after="60" w:line="276" w:lineRule="auto"/>
               <w:rPr>
                 <w:rFonts w:cstheme="minorBidi"/>
                 <w:color w:val="auto"/>
@@ -4836,8 +4685,7 @@
           </w:tcPr>
           <w:p>
             <w:pPr>
-              <w:spacing w:before="0" w:after="200" w:line="276" w:lineRule="auto"/>
-              <w:jc w:val="center"/>
+              <w:spacing w:before="60" w:after="60" w:line="276" w:lineRule="auto"/>
               <w:rPr>
                 <w:rFonts w:cstheme="minorBidi"/>
                 <w:color w:val="auto"/>
@@ -4858,8 +4706,7 @@
           </w:tcPr>
           <w:p>
             <w:pPr>
-              <w:spacing w:before="0" w:after="200" w:line="276" w:lineRule="auto"/>
-              <w:jc w:val="center"/>
+              <w:spacing w:before="60" w:after="60" w:line="276" w:lineRule="auto"/>
               <w:rPr>
                 <w:rFonts w:cstheme="minorBidi"/>
                 <w:color w:val="auto"/>
@@ -4882,7 +4729,6 @@
         <w:pStyle w:val="Heading3"/>
       </w:pPr>
       <w:r>
-        <w:lastRenderedPageBreak/>
         <w:t xml:space="preserve">Cycling Infrastructure  </w:t>
       </w:r>
     </w:p>
@@ -4973,6 +4819,7 @@
           <w:rFonts w:eastAsia="Times New Roman"/>
           <w:lang w:eastAsia="en-AU"/>
         </w:rPr>
+        <w:lastRenderedPageBreak/>
         <w:t>Figure 4: Bicycle Network around the site</w:t>
       </w:r>
     </w:p>
@@ -7702,7 +7549,7 @@
           <w:rStyle w:val="Hyperlink"/>
         </w:rPr>
       </w:pPr>
-      <w:hyperlink r:id="rId16" w:history="1">
+      <w:hyperlink r:id="rId13" w:history="1">
         <w:r>
           <w:rPr>
             <w:rStyle w:val="Hyperlink"/>
@@ -7712,7 +7559,7 @@
       </w:hyperlink>
     </w:p>
     <w:p>
-      <w:hyperlink r:id="rId17" w:history="1">
+      <w:hyperlink r:id="rId14" w:history="1">
         <w:r>
           <w:rPr>
             <w:rStyle w:val="Hyperlink"/>
@@ -7728,7 +7575,7 @@
       </w:r>
     </w:p>
     <w:p>
-      <w:hyperlink r:id="rId18" w:history="1">
+      <w:hyperlink r:id="rId15" w:history="1">
         <w:r>
           <w:rPr>
             <w:rStyle w:val="Hyperlink"/>
@@ -7778,7 +7625,7 @@
       </w:r>
     </w:p>
     <w:p>
-      <w:hyperlink r:id="rId19" w:history="1">
+      <w:hyperlink r:id="rId16" w:history="1">
         <w:r>
           <w:rPr>
             <w:rStyle w:val="Hyperlink"/>
@@ -7821,7 +7668,7 @@
           <w:lang w:val="fr-FR"/>
         </w:rPr>
       </w:pPr>
-      <w:hyperlink r:id="rId20" w:history="1">
+      <w:hyperlink r:id="rId17" w:history="1">
         <w:r>
           <w:rPr>
             <w:rStyle w:val="Hyperlink"/>
@@ -7838,7 +7685,7 @@
           <w:lang w:val="fr-FR"/>
         </w:rPr>
       </w:pPr>
-      <w:hyperlink r:id="rId21" w:history="1">
+      <w:hyperlink r:id="rId18" w:history="1">
         <w:r>
           <w:rPr>
             <w:rStyle w:val="Hyperlink"/>
@@ -7854,7 +7701,7 @@
           <w:rStyle w:val="Hyperlink"/>
         </w:rPr>
       </w:pPr>
-      <w:hyperlink r:id="rId22" w:history="1">
+      <w:hyperlink r:id="rId19" w:history="1">
         <w:r>
           <w:rPr>
             <w:rStyle w:val="Hyperlink"/>
@@ -7870,8 +7717,8 @@
     </w:p>
     <w:p/>
     <w:sectPr>
-      <w:headerReference w:type="first" r:id="rId23"/>
-      <w:footerReference w:type="first" r:id="rId24"/>
+      <w:headerReference w:type="first" r:id="rId20"/>
+      <w:footerReference w:type="first" r:id="rId21"/>
       <w:pgSz w:w="11907" w:h="16839" w:code="9"/>
       <w:pgMar w:top="1701" w:right="1021" w:bottom="1021" w:left="1021" w:header="680" w:footer="680" w:gutter="0"/>
       <w:cols w:space="720"/>
@@ -8259,29 +8106,12 @@
     <w:r>
       <w:ptab w:relativeTo="margin" w:alignment="right" w:leader="none"/>
     </w:r>
-    <w:sdt>
-      <w:sdtPr>
-        <w:rPr>
-          <w:color w:val="00602B" w:themeColor="text2"/>
-        </w:rPr>
-        <w:alias w:val="Company Address"/>
-        <w:tag w:val=""/>
-        <w:id w:val="-1943907609"/>
-        <w:placeholder>
-          <w:docPart w:val="71ADB0C41D9DEE44BAF13E2629C6DC2E"/>
-        </w:placeholder>
-        <w:dataBinding w:prefixMappings="xmlns:ns0='http://schemas.microsoft.com/office/2006/coverPageProps' " w:xpath="/ns0:CoverPageProperties[1]/ns0:CompanyAddress[1]" w:storeItemID="{55AF091B-3C7A-41E3-B477-F2FDAA23CFDA}"/>
-        <w:text/>
-      </w:sdtPr>
-      <w:sdtContent>
-        <w:r>
-          <w:rPr>
-            <w:color w:val="00602B" w:themeColor="text2"/>
-          </w:rPr>
-          <w:t w:space="preserve">{projectAddress}</w:t>
-        </w:r>
-      </w:sdtContent>
-    </w:sdt>
+    <w:r>
+      <w:rPr>
+        <w:color w:val="00602B" w:themeColor="text2"/>
+      </w:rPr>
+      <w:t w:space="preserve">{projectAddress}</w:t>
+    </w:r>
     <w:r>
       <w:rPr>
         <w:color w:val="00602B" w:themeColor="text2"/>
@@ -8843,29 +8673,12 @@
       </w:rPr>
       <w:t xml:space="preserve"> </w:t>
     </w:r>
-    <w:sdt>
-      <w:sdtPr>
-        <w:rPr>
-          <w:color w:val="00602B" w:themeColor="text2"/>
-        </w:rPr>
-        <w:alias w:val="Company Address"/>
-        <w:tag w:val=""/>
-        <w:id w:val="-1986379602"/>
-        <w:placeholder>
-          <w:docPart w:val="B9B41254596D4F7383A8AAB5EDB8A448"/>
-        </w:placeholder>
-        <w:dataBinding w:prefixMappings="xmlns:ns0='http://schemas.microsoft.com/office/2006/coverPageProps' " w:xpath="/ns0:CoverPageProperties[1]/ns0:CompanyAddress[1]" w:storeItemID="{55AF091B-3C7A-41E3-B477-F2FDAA23CFDA}"/>
-        <w:text/>
-      </w:sdtPr>
-      <w:sdtContent>
-        <w:r>
-          <w:rPr>
-            <w:color w:val="00602B" w:themeColor="text2"/>
-          </w:rPr>
-          <w:t w:space="preserve">{projectAddress}</w:t>
-        </w:r>
-      </w:sdtContent>
-    </w:sdt>
+    <w:r>
+      <w:rPr>
+        <w:color w:val="00602B" w:themeColor="text2"/>
+      </w:rPr>
+      <w:t w:space="preserve">{projectAddress}</w:t>
+    </w:r>
     <w:r>
       <w:rPr>
         <w:color w:val="00602B" w:themeColor="text2"/>
@@ -14984,6 +14797,7 @@
     <w:rsid w:val="00355486"/>
     <w:rsid w:val="00355A99"/>
     <w:rsid w:val="0037731B"/>
+    <w:rsid w:val="003974EA"/>
     <w:rsid w:val="003B2849"/>
     <w:rsid w:val="003C40DB"/>
     <w:rsid w:val="003E5ECE"/>
@@ -15099,6 +14913,7 @@
     <w:rsid w:val="00CF74FB"/>
     <w:rsid w:val="00D215EF"/>
     <w:rsid w:val="00D237B9"/>
+    <w:rsid w:val="00D3103A"/>
     <w:rsid w:val="00D3119E"/>
     <w:rsid w:val="00D364D5"/>
     <w:rsid w:val="00D53F78"/>

</xml_diff>

<commit_message>
Remove redundant transport narrative paragraph from the report
The prose block restating train/tram/bus/car-share distances duplicated
exactly what the Existing Transport Infrastructure table below it
already shows. Deleted from the template and removed the
transportNarrative field entirely (it wasn't surfaced in the review UI,
only the docx export).
</commit_message>
<xml_diff>
--- a/backend/src/docx/template.docx
+++ b/backend/src/docx/template.docx
@@ -3295,27 +3295,6 @@
           <w:szCs w:val="24"/>
         </w:rPr>
         <w:t>Public Transport</w:t>
-      </w:r>
-    </w:p>
-    <w:p>
-      <w:pPr>
-        <w:pStyle w:val="RegularText"/>
-        <w:rPr>
-          <w:color w:val="00602B" w:themeColor="text2"/>
-          <w:sz w:val="26"/>
-          <w:szCs w:val="26"/>
-        </w:rPr>
-      </w:pPr>
-      <w:bookmarkStart w:id="29" w:name="_Toc451243777"/>
-      <w:r>
-        <w:t w:space="preserve">{transportNarrative}</w:t>
-      </w:r>
-      <w:r>
-        <w:rPr>
-          <w:sz w:val="26"/>
-          <w:szCs w:val="26"/>
-        </w:rPr>
-        <w:t/>
       </w:r>
     </w:p>
     <w:tbl>

</xml_diff>

<commit_message>
Fill the template's own Car Share Provider table instead of adding a new one
Previously the generator left the template's existing "Car Share
Provider | Location | Approximate Distance/ Walk Time" table blank and
inserted a separate "Nearby Car Share Pods (live data)" table
elsewhere — confusing, with one table always empty. Now the live
carSharePods data (split into provider/location from the OSM
operator+name tags) fills the template's own table directly, and its
intro sentence is conditional on whether any pods were found.
</commit_message>
<xml_diff>
--- a/backend/src/docx/template.docx
+++ b/backend/src/docx/template.docx
@@ -3838,21 +3838,21 @@
           <w:rFonts w:cstheme="minorBidi"/>
           <w:color w:val="auto"/>
         </w:rPr>
-        <w:t xml:space="preserve">There are several car share services available at the subject site as shown in </w:t>
+        <w:t xml:space="preserve" w:space="preserve">{#hasCarSharePods}There are several car share services available at the subject site as shown in the table below.{/hasCarSharePods}{^hasCarSharePods}No car-share pods were identified within the search radius via OpenStreetMap — confirm manually.{/hasCarSharePods}</w:t>
       </w:r>
       <w:r>
         <w:rPr>
           <w:rFonts w:cstheme="minorBidi"/>
           <w:color w:val="auto"/>
         </w:rPr>
-        <w:t>Table 2</w:t>
+        <w:t/>
       </w:r>
       <w:r>
         <w:rPr>
           <w:rFonts w:cstheme="minorBidi"/>
           <w:color w:val="auto"/>
         </w:rPr>
-        <w:t xml:space="preserve"> below. </w:t>
+        <w:t xml:space="preserve"/>
       </w:r>
     </w:p>
     <w:tbl>
@@ -3974,6 +3974,9 @@
                 <w:color w:val="auto"/>
               </w:rPr>
             </w:pPr>
+            <w:r>
+              <w:t>{#carSharePods}{provider}</w:t>
+            </w:r>
           </w:p>
         </w:tc>
         <w:tc>
@@ -3993,6 +3996,9 @@
                 <w:szCs w:val="26"/>
               </w:rPr>
             </w:pPr>
+            <w:r>
+              <w:t>{location}</w:t>
+            </w:r>
           </w:p>
         </w:tc>
         <w:tc>
@@ -4012,108 +4018,9 @@
                 <w:szCs w:val="26"/>
               </w:rPr>
             </w:pPr>
-          </w:p>
-        </w:tc>
-      </w:tr>
-      <w:tr>
-        <w:trPr>
-          <w:trHeight w:val="480"/>
-        </w:trPr>
-        <w:tc>
-          <w:tcPr>
-            <w:tcW w:w="3306" w:type="dxa"/>
-          </w:tcPr>
-          <w:p>
-            <w:pPr>
-              <w:spacing w:before="60" w:after="60" w:line="240" w:lineRule="auto"/>
-              <w:rPr>
-                <w:rFonts w:cstheme="minorBidi"/>
-                <w:color w:val="auto"/>
-              </w:rPr>
-            </w:pPr>
-          </w:p>
-        </w:tc>
-        <w:tc>
-          <w:tcPr>
-            <w:tcW w:w="3306" w:type="dxa"/>
-          </w:tcPr>
-          <w:p>
-            <w:pPr>
-              <w:spacing w:before="60" w:after="60" w:line="240" w:lineRule="auto"/>
-              <w:rPr>
-                <w:rFonts w:cstheme="minorBidi"/>
-                <w:color w:val="00602B" w:themeColor="text2"/>
-                <w:sz w:val="26"/>
-                <w:szCs w:val="26"/>
-              </w:rPr>
-            </w:pPr>
-          </w:p>
-        </w:tc>
-        <w:tc>
-          <w:tcPr>
-            <w:tcW w:w="3306" w:type="dxa"/>
-          </w:tcPr>
-          <w:p>
-            <w:pPr>
-              <w:spacing w:before="60" w:after="60" w:line="240" w:lineRule="auto"/>
-              <w:rPr>
-                <w:rFonts w:cstheme="minorBidi"/>
-                <w:color w:val="00602B" w:themeColor="text2"/>
-                <w:sz w:val="26"/>
-                <w:szCs w:val="26"/>
-              </w:rPr>
-            </w:pPr>
-          </w:p>
-        </w:tc>
-      </w:tr>
-      <w:tr>
-        <w:trPr>
-          <w:trHeight w:val="442"/>
-        </w:trPr>
-        <w:tc>
-          <w:tcPr>
-            <w:tcW w:w="3306" w:type="dxa"/>
-          </w:tcPr>
-          <w:p>
-            <w:pPr>
-              <w:spacing w:before="60" w:after="60" w:line="240" w:lineRule="auto"/>
-              <w:rPr>
-                <w:rFonts w:cstheme="minorBidi"/>
-                <w:color w:val="auto"/>
-              </w:rPr>
-            </w:pPr>
-          </w:p>
-        </w:tc>
-        <w:tc>
-          <w:tcPr>
-            <w:tcW w:w="3306" w:type="dxa"/>
-          </w:tcPr>
-          <w:p>
-            <w:pPr>
-              <w:spacing w:before="60" w:after="60" w:line="240" w:lineRule="auto"/>
-              <w:rPr>
-                <w:rFonts w:cstheme="minorBidi"/>
-                <w:color w:val="00602B" w:themeColor="text2"/>
-                <w:sz w:val="26"/>
-                <w:szCs w:val="26"/>
-              </w:rPr>
-            </w:pPr>
-          </w:p>
-        </w:tc>
-        <w:tc>
-          <w:tcPr>
-            <w:tcW w:w="3306" w:type="dxa"/>
-          </w:tcPr>
-          <w:p>
-            <w:pPr>
-              <w:spacing w:before="60" w:after="60" w:line="240" w:lineRule="auto"/>
-              <w:rPr>
-                <w:rFonts w:cstheme="minorBidi"/>
-                <w:color w:val="00602B" w:themeColor="text2"/>
-                <w:sz w:val="26"/>
-                <w:szCs w:val="26"/>
-              </w:rPr>
-            </w:pPr>
+            <w:r>
+              <w:t>{distanceWalk}{/carSharePods}</w:t>
+            </w:r>
           </w:p>
         </w:tc>
       </w:tr>
@@ -4127,104 +4034,6 @@
         </w:rPr>
       </w:pPr>
     </w:p>
-    <w:p>
-      <w:pPr>
-        <w:pStyle w:val="Heading3"/>
-      </w:pPr>
-      <w:r>
-        <w:t>Nearby Car Share Pods (live data)</w:t>
-      </w:r>
-    </w:p>
-    <w:p>
-      <w:r>
-        <w:t>{#hasCarSharePods}The following car-share pods were identified within the search radius via OpenStreetMap:{/hasCarSharePods}{^hasCarSharePods}No car-share pods were identified within the search radius via OpenStreetMap — confirm manually.{/hasCarSharePods}</w:t>
-      </w:r>
-    </w:p>
-    <w:tbl>
-      <w:tblPr>
-        <w:tblStyle w:val="TableGrid"/>
-        <w:tblW w:type="auto" w:w="0"/>
-        <w:tblLook w:firstColumn="1" w:firstRow="1" w:lastColumn="0" w:lastRow="0" w:noHBand="0" w:noVBand="1" w:val="04A0"/>
-      </w:tblPr>
-      <w:tblGrid>
-        <w:gridCol w:w="3288"/>
-        <w:gridCol w:w="3288"/>
-        <w:gridCol w:w="3288"/>
-      </w:tblGrid>
-      <w:tr>
-        <w:tc>
-          <w:tcPr>
-            <w:tcW w:type="dxa" w:w="3288"/>
-          </w:tcPr>
-          <w:p>
-            <w:r>
-              <w:rPr>
-                <w:b/>
-              </w:rPr>
-              <w:t>Name</w:t>
-            </w:r>
-          </w:p>
-        </w:tc>
-        <w:tc>
-          <w:tcPr>
-            <w:tcW w:type="dxa" w:w="3288"/>
-          </w:tcPr>
-          <w:p>
-            <w:r>
-              <w:rPr>
-                <w:b/>
-              </w:rPr>
-              <w:t>Distance</w:t>
-            </w:r>
-          </w:p>
-        </w:tc>
-        <w:tc>
-          <w:tcPr>
-            <w:tcW w:type="dxa" w:w="3288"/>
-          </w:tcPr>
-          <w:p>
-            <w:r>
-              <w:rPr>
-                <w:b/>
-              </w:rPr>
-              <w:t>Walk time</w:t>
-            </w:r>
-          </w:p>
-        </w:tc>
-      </w:tr>
-      <w:tr>
-        <w:tc>
-          <w:tcPr>
-            <w:tcW w:type="dxa" w:w="3288"/>
-          </w:tcPr>
-          <w:p>
-            <w:r>
-              <w:t>{#carSharePods}{name}</w:t>
-            </w:r>
-          </w:p>
-        </w:tc>
-        <w:tc>
-          <w:tcPr>
-            <w:tcW w:type="dxa" w:w="3288"/>
-          </w:tcPr>
-          <w:p>
-            <w:r>
-              <w:t>{distanceLabel}</w:t>
-            </w:r>
-          </w:p>
-        </w:tc>
-        <w:tc>
-          <w:tcPr>
-            <w:tcW w:type="dxa" w:w="3288"/>
-          </w:tcPr>
-          <w:p>
-            <w:r>
-              <w:t>{walkMinutes} min{/carSharePods}</w:t>
-            </w:r>
-          </w:p>
-        </w:tc>
-      </w:tr>
-    </w:tbl>
     <w:p>
       <w:pPr>
         <w:pStyle w:val="Heading3"/>

</xml_diff>